<commit_message>
style: remove every em-dash and humanize the repo's text
Repo-wide pass over comments, user-facing copy, docs and the report source. Removed
every em-dash (the literal — and the &mdash;/&#8212; entities) and the few prose
en-dashes, replacing them with commas, colons, semicolons, periods, or a middot for
separators. Numeric ranges and proper names (24-48h, 2020-2024, Jensen-Shannon) kept.
Where comments or copy read robotic, rewrote them to sound like a person wrote them,
warm, plain and concise, with meaning preserved.

Strictly text-only: no code logic, identifiers, JSON keys, API routes, env names,
numeric thresholds, regex, intent keywords, or cryptographic/canonical fields were
touched. Regenerated public/report.html and the .docx from the cleaned sources.

Verified: 0 em-dashes/entities across all tracked files, report.html and the .docx;
117 node:test cases still pass; report build succeeds.

Co-Authored-By: Claude Opus 4.7 (1M context) <noreply@anthropic.com>
</commit_message>
<xml_diff>
--- a/CAPSTONE PROJECT REPORT.docx
+++ b/CAPSTONE PROJECT REPORT.docx
@@ -7126,7 +7126,7 @@
           <w:color w:val="595959"/>
           <w:sz w:val="20"/>
         </w:rPr>
-        <w:t>(a) Resident dashboard — light theme</w:t>
+        <w:t>(a) Resident dashboard, light theme</w:t>
       </w:r>
     </w:p>
     <w:p>
@@ -7185,7 +7185,7 @@
           <w:color w:val="595959"/>
           <w:sz w:val="20"/>
         </w:rPr>
-        <w:t>(b) Resident dashboard — dark theme</w:t>
+        <w:t>(b) Resident dashboard, dark theme</w:t>
       </w:r>
     </w:p>
     <w:p>
@@ -7244,7 +7244,7 @@
           <w:color w:val="595959"/>
           <w:sz w:val="20"/>
         </w:rPr>
-        <w:t>(c) Satellite Intelligence panel — light theme</w:t>
+        <w:t>(c) Satellite Intelligence panel, light theme</w:t>
       </w:r>
     </w:p>
     <w:p>
@@ -7303,7 +7303,7 @@
           <w:color w:val="595959"/>
           <w:sz w:val="20"/>
         </w:rPr>
-        <w:t>(d) Satellite Intelligence panel — dark theme</w:t>
+        <w:t>(d) Satellite Intelligence panel, dark theme</w:t>
       </w:r>
     </w:p>
     <w:p>

</xml_diff>